<commit_message>
feat: implement food order review system and restaurant management capabilities
</commit_message>
<xml_diff>
--- a/DOCUMENT/TỔNG HỢP API MOBILE APP (CUSTOMER & DRIVER).docx
+++ b/DOCUMENT/TỔNG HỢP API MOBILE APP (CUSTOMER & DRIVER).docx
@@ -2803,7 +2803,7 @@
           <w:color w:val="2E75B6"/>
           <w:rFonts w:ascii="Consolas" w:hAnsi="Consolas"/>
         </w:rPr>
-        <w:t xml:space="preserve">ApiResponse&lt;List&lt;RestaurantResponse&gt;&gt; (Danh sách quán ăn: id, name, address, phone, imageUrl, rating, openHours, isOpen)</w:t>
+        <w:t xml:space="preserve">ApiResponse&lt;List&lt;RestaurantResponse&gt;&gt; (Danh sách quán ăn: id, name, address, phone, imageUrl, rating: điểm sao TB, reviewCount / totalReviews: tổng lượt đánh giá, openHours, isOpen)</w:t>
       </w:r>
     </w:p>
     <w:p>
@@ -4091,6 +4091,512 @@
           <w:rFonts w:ascii="Consolas" w:hAnsi="Consolas"/>
         </w:rPr>
         <w:t xml:space="preserve">String: 'SUCCESS' hoặc 'PENDING'</w:t>
+      </w:r>
+    </w:p>
+    <w:p>
+      <w:pPr>
+        <w:spacing w:before="300" w:after="120"/>
+      </w:pPr>
+      <w:r>
+        <w:rPr>
+          <w:b/>
+          <w:color w:val="2E75B6"/>
+        </w:rPr>
+        <w:t>6. Đánh Giá Đơn Đồ Ăn &amp; Xem Nhận Xét Quán Ăn (/api/v1/food-reviews, /api/v1/restaurants/{id}/reviews)</w:t>
+      </w:r>
+    </w:p>
+    <w:p>
+      <w:pPr>
+        <w:spacing w:before="240" w:after="60"/>
+      </w:pPr>
+      <w:r>
+        <w:rPr>
+          <w:b/>
+          <w:color w:val="1F4E79"/>
+        </w:rPr>
+        <w:t xml:space="preserve">[POST] </w:t>
+      </w:r>
+      <w:r>
+        <w:rPr>
+          <w:b/>
+          <w:color w:val="000000"/>
+        </w:rPr>
+        <w:t>/api/v1/food-reviews/upload-image</w:t>
+      </w:r>
+    </w:p>
+    <w:p>
+      <w:pPr>
+        <w:spacing w:before="20" w:after="40"/>
+        <w:ind w:left="360"/>
+      </w:pPr>
+      <w:r>
+        <w:rPr>
+          <w:b/>
+          <w:color w:val="333333"/>
+        </w:rPr>
+        <w:t xml:space="preserve">• Mô tả: </w:t>
+      </w:r>
+      <w:r>
+        <w:rPr>
+          <w:color w:val="333333"/>
+        </w:rPr>
+        <w:t>Tải ảnh chụp món ăn/hóa đơn lên hệ thống lưu trữ Cloudinary trước khi gửi đánh giá đơn hàng. Mobile app chỉ cho phép người dùng đính kèm các tệp hình ảnh định dạng PNG, JPG, JPEG hoặc WEBP.</w:t>
+      </w:r>
+    </w:p>
+    <w:p>
+      <w:pPr>
+        <w:spacing w:before="20" w:after="40"/>
+        <w:ind w:left="360"/>
+      </w:pPr>
+      <w:r>
+        <w:rPr>
+          <w:b/>
+          <w:color w:val="333333"/>
+        </w:rPr>
+        <w:t xml:space="preserve">• Phân quyền / Header: </w:t>
+      </w:r>
+      <w:r>
+        <w:rPr>
+          <w:color w:val="333333"/>
+        </w:rPr>
+        <w:t>Bearer Token (Header Authorization)</w:t>
+      </w:r>
+    </w:p>
+    <w:p>
+      <w:pPr>
+        <w:spacing w:before="20" w:after="40"/>
+        <w:ind w:left="360"/>
+      </w:pPr>
+      <w:r>
+        <w:rPr>
+          <w:b/>
+          <w:color w:val="333333"/>
+        </w:rPr>
+        <w:t xml:space="preserve">• Tham số (Form-Data): </w:t>
+      </w:r>
+      <w:r>
+        <w:rPr>
+          <w:color w:val="333333"/>
+        </w:rPr>
+        <w:t>file (MultipartFile [Bắt buộc] - Tệp hình ảnh ảnh chụp món ăn/hóa đơn)</w:t>
+      </w:r>
+    </w:p>
+    <w:p>
+      <w:pPr>
+        <w:spacing w:before="20" w:after="40"/>
+        <w:ind w:left="360"/>
+      </w:pPr>
+      <w:r>
+        <w:rPr>
+          <w:b/>
+          <w:color w:val="333333"/>
+        </w:rPr>
+        <w:t xml:space="preserve">• Kết quả trả về (Response): </w:t>
+      </w:r>
+      <w:r>
+        <w:rPr>
+          <w:color w:val="2E75B6"/>
+        </w:rPr>
+        <w:t>ApiResponse&lt;Map&lt;String, String&gt;&gt; (url: Đường dẫn ảnh CDN Cloudinary HTTPS, publicId: Mã định danh Cloudinary)</w:t>
+      </w:r>
+    </w:p>
+    <w:p>
+      <w:pPr>
+        <w:spacing w:before="240" w:after="60"/>
+      </w:pPr>
+      <w:r>
+        <w:rPr>
+          <w:b/>
+          <w:color w:val="1F4E79"/>
+        </w:rPr>
+        <w:t xml:space="preserve">[POST] </w:t>
+      </w:r>
+      <w:r>
+        <w:rPr>
+          <w:b/>
+          <w:color w:val="000000"/>
+        </w:rPr>
+        <w:t>/api/v1/food-reviews</w:t>
+      </w:r>
+    </w:p>
+    <w:p>
+      <w:pPr>
+        <w:spacing w:before="20" w:after="40"/>
+        <w:ind w:left="360"/>
+      </w:pPr>
+      <w:r>
+        <w:rPr>
+          <w:b/>
+          <w:color w:val="333333"/>
+        </w:rPr>
+        <w:t xml:space="preserve">• Mô tả: </w:t>
+      </w:r>
+      <w:r>
+        <w:rPr>
+          <w:color w:val="333333"/>
+        </w:rPr>
+        <w:t>Khách hàng gửi đánh giá mới hoặc cập nhật đánh giá cho đơn hàng đồ ăn đã giao thành công (DELIVERED). Ràng buộc 1 tuần: Đơn hàng hoàn thành quá 7 ngày sẽ bị khóa hoàn toàn, không thể gửi đánh giá mới (HTTP 400). Ràng buộc 48 giờ: Cho phép chỉnh sửa nội dung đánh giá trong vòng 48h kể từ lúc tạo (createdAt + 48h); sau 48h app tự động khóa tính năng chỉnh sửa và chuyển sang chế độ chỉ xem. Tự động cập nhật điểm sao trung bình (rating) và tổng số lượt đánh giá (reviewCount / totalReviews) của quán ăn.</w:t>
+      </w:r>
+    </w:p>
+    <w:p>
+      <w:pPr>
+        <w:spacing w:before="20" w:after="40"/>
+        <w:ind w:left="360"/>
+      </w:pPr>
+      <w:r>
+        <w:rPr>
+          <w:b/>
+          <w:color w:val="333333"/>
+        </w:rPr>
+        <w:t xml:space="preserve">• Phân quyền / Header: </w:t>
+      </w:r>
+      <w:r>
+        <w:rPr>
+          <w:color w:val="333333"/>
+        </w:rPr>
+        <w:t>Bearer Token (Header Authorization, X-User-Id)</w:t>
+      </w:r>
+    </w:p>
+    <w:p>
+      <w:pPr>
+        <w:spacing w:before="20" w:after="40"/>
+        <w:ind w:left="360"/>
+      </w:pPr>
+      <w:r>
+        <w:rPr>
+          <w:b/>
+          <w:color w:val="333333"/>
+        </w:rPr>
+        <w:t xml:space="preserve">• Danh sách trường Request Body (JSON): </w:t>
+      </w:r>
+      <w:r>
+        <w:rPr>
+          <w:color w:val="333333"/>
+        </w:rPr>
+        <w:t>Chi tiết các trường dữ liệu:</w:t>
+      </w:r>
+    </w:p>
+    <w:p>
+      <w:pPr>
+        <w:spacing w:before="10" w:after="30"/>
+        <w:ind w:left="720"/>
+      </w:pPr>
+      <w:r>
+        <w:rPr>
+          <w:b/>
+          <w:color w:val="555555"/>
+        </w:rPr>
+        <w:t xml:space="preserve">- orderId: </w:t>
+      </w:r>
+      <w:r>
+        <w:rPr>
+          <w:color w:val="333333"/>
+        </w:rPr>
+        <w:t>(Long) [Bắt buộc] Mã định danh đơn hàng đồ ăn đã hoàn thành</w:t>
+      </w:r>
+    </w:p>
+    <w:p>
+      <w:pPr>
+        <w:spacing w:before="10" w:after="30"/>
+        <w:ind w:left="720"/>
+      </w:pPr>
+      <w:r>
+        <w:rPr>
+          <w:b/>
+          <w:color w:val="555555"/>
+        </w:rPr>
+        <w:t xml:space="preserve">- restaurantRating: </w:t>
+      </w:r>
+      <w:r>
+        <w:rPr>
+          <w:color w:val="333333"/>
+        </w:rPr>
+        <w:t>(Integer) [Bắt buộc] Điểm đánh giá quán ăn từ 1 đến 5 sao</w:t>
+      </w:r>
+    </w:p>
+    <w:p>
+      <w:pPr>
+        <w:spacing w:before="10" w:after="30"/>
+        <w:ind w:left="720"/>
+      </w:pPr>
+      <w:r>
+        <w:rPr>
+          <w:b/>
+          <w:color w:val="555555"/>
+        </w:rPr>
+        <w:t xml:space="preserve">- restaurantComment: </w:t>
+      </w:r>
+      <w:r>
+        <w:rPr>
+          <w:color w:val="333333"/>
+        </w:rPr>
+        <w:t>(String) [Tùy chọn] Nhận xét chi tiết về món ăn và chất lượng dịch vụ</w:t>
+      </w:r>
+    </w:p>
+    <w:p>
+      <w:pPr>
+        <w:spacing w:before="10" w:after="30"/>
+        <w:ind w:left="720"/>
+      </w:pPr>
+      <w:r>
+        <w:rPr>
+          <w:b/>
+          <w:color w:val="555555"/>
+        </w:rPr>
+        <w:t xml:space="preserve">- driverRating: </w:t>
+      </w:r>
+      <w:r>
+        <w:rPr>
+          <w:color w:val="333333"/>
+        </w:rPr>
+        <w:t>(Integer) [Bắt buộc] Điểm đánh giá tài xế giao hàng từ 1 đến 5 sao</w:t>
+      </w:r>
+    </w:p>
+    <w:p>
+      <w:pPr>
+        <w:spacing w:before="10" w:after="30"/>
+        <w:ind w:left="720"/>
+      </w:pPr>
+      <w:r>
+        <w:rPr>
+          <w:b/>
+          <w:color w:val="555555"/>
+        </w:rPr>
+        <w:t xml:space="preserve">- driverTags: </w:t>
+      </w:r>
+      <w:r>
+        <w:rPr>
+          <w:color w:val="333333"/>
+        </w:rPr>
+        <w:t>(List&lt;String&gt;) [Tùy chọn] Danh sách tag nhận xét tài xế (VD: 'Giao hàng nhanh', 'Thân thiện', 'Bảo quản cẩn thận')</w:t>
+      </w:r>
+    </w:p>
+    <w:p>
+      <w:pPr>
+        <w:spacing w:before="10" w:after="30"/>
+        <w:ind w:left="720"/>
+      </w:pPr>
+      <w:r>
+        <w:rPr>
+          <w:b/>
+          <w:color w:val="555555"/>
+        </w:rPr>
+        <w:t xml:space="preserve">- reviewPhotos: </w:t>
+      </w:r>
+      <w:r>
+        <w:rPr>
+          <w:color w:val="333333"/>
+        </w:rPr>
+        <w:t>(List&lt;String&gt;) [Tùy chọn] Danh sách URL ảnh đính kèm (tối đa 5 ảnh tải lên từ Cloudinary)</w:t>
+      </w:r>
+    </w:p>
+    <w:p>
+      <w:pPr>
+        <w:spacing w:before="20" w:after="40"/>
+        <w:ind w:left="360"/>
+      </w:pPr>
+      <w:r>
+        <w:rPr>
+          <w:b/>
+          <w:color w:val="333333"/>
+        </w:rPr>
+        <w:t xml:space="preserve">• Kết quả trả về (Response): </w:t>
+      </w:r>
+      <w:r>
+        <w:rPr>
+          <w:color w:val="2E75B6"/>
+        </w:rPr>
+        <w:t>ApiResponse&lt;FoodOrderReviewResponse&gt; (id, orderId, restaurantRating, restaurantComment, driverRating, driverTags, reviewPhotos, merchantReply, merchantReplyAt, createdAt, readOnly: boolean)</w:t>
+      </w:r>
+    </w:p>
+    <w:p>
+      <w:pPr>
+        <w:spacing w:before="240" w:after="60"/>
+      </w:pPr>
+      <w:r>
+        <w:rPr>
+          <w:b/>
+          <w:color w:val="375623"/>
+        </w:rPr>
+        <w:t xml:space="preserve">[GET] </w:t>
+      </w:r>
+      <w:r>
+        <w:rPr>
+          <w:b/>
+          <w:color w:val="000000"/>
+        </w:rPr>
+        <w:t>/api/v1/food-reviews/order/{orderId}</w:t>
+      </w:r>
+    </w:p>
+    <w:p>
+      <w:pPr>
+        <w:spacing w:before="20" w:after="40"/>
+        <w:ind w:left="360"/>
+      </w:pPr>
+      <w:r>
+        <w:rPr>
+          <w:b/>
+          <w:color w:val="333333"/>
+        </w:rPr>
+        <w:t xml:space="preserve">• Mô tả: </w:t>
+      </w:r>
+      <w:r>
+        <w:rPr>
+          <w:color w:val="333333"/>
+        </w:rPr>
+        <w:t>Khách hàng kiểm tra xem đơn hàng đã từng đánh giá hay chưa và kiểm tra cờ readOnly (true nếu đã quá 48h để khóa nút sửa trên giao diện mobile app).</w:t>
+      </w:r>
+    </w:p>
+    <w:p>
+      <w:pPr>
+        <w:spacing w:before="20" w:after="40"/>
+        <w:ind w:left="360"/>
+      </w:pPr>
+      <w:r>
+        <w:rPr>
+          <w:b/>
+          <w:color w:val="333333"/>
+        </w:rPr>
+        <w:t xml:space="preserve">• Phân quyền / Header: </w:t>
+      </w:r>
+      <w:r>
+        <w:rPr>
+          <w:color w:val="333333"/>
+        </w:rPr>
+        <w:t>Bearer Token (Header Authorization)</w:t>
+      </w:r>
+    </w:p>
+    <w:p>
+      <w:pPr>
+        <w:spacing w:before="20" w:after="40"/>
+        <w:ind w:left="360"/>
+      </w:pPr>
+      <w:r>
+        <w:rPr>
+          <w:b/>
+          <w:color w:val="333333"/>
+        </w:rPr>
+        <w:t xml:space="preserve">• Tham số (Path / Query Params): </w:t>
+      </w:r>
+      <w:r>
+        <w:rPr>
+          <w:color w:val="333333"/>
+        </w:rPr>
+        <w:t>orderId (Long - Mã đơn hàng đồ ăn)</w:t>
+      </w:r>
+    </w:p>
+    <w:p>
+      <w:pPr>
+        <w:spacing w:before="20" w:after="40"/>
+        <w:ind w:left="360"/>
+      </w:pPr>
+      <w:r>
+        <w:rPr>
+          <w:b/>
+          <w:color w:val="333333"/>
+        </w:rPr>
+        <w:t xml:space="preserve">• Kết quả trả về (Response): </w:t>
+      </w:r>
+      <w:r>
+        <w:rPr>
+          <w:color w:val="2E75B6"/>
+        </w:rPr>
+        <w:t>ApiResponse&lt;FoodOrderReviewResponse&gt; (Chi tiết đánh giá của đơn, kèm readOnly: true/false)</w:t>
+      </w:r>
+    </w:p>
+    <w:p>
+      <w:pPr>
+        <w:spacing w:before="240" w:after="60"/>
+      </w:pPr>
+      <w:r>
+        <w:rPr>
+          <w:b/>
+          <w:color w:val="375623"/>
+        </w:rPr>
+        <w:t xml:space="preserve">[GET] </w:t>
+      </w:r>
+      <w:r>
+        <w:rPr>
+          <w:b/>
+          <w:color w:val="000000"/>
+        </w:rPr>
+        <w:t>/api/v1/restaurants/{restaurantId}/reviews</w:t>
+      </w:r>
+    </w:p>
+    <w:p>
+      <w:pPr>
+        <w:spacing w:before="20" w:after="40"/>
+        <w:ind w:left="360"/>
+      </w:pPr>
+      <w:r>
+        <w:rPr>
+          <w:b/>
+          <w:color w:val="333333"/>
+        </w:rPr>
+        <w:t xml:space="preserve">• Mô tả: </w:t>
+      </w:r>
+      <w:r>
+        <w:rPr>
+          <w:color w:val="333333"/>
+        </w:rPr>
+        <w:t>Khách hàng xem danh sách các đánh giá, ảnh chụp món ăn thực tế và phản hồi của nhà hàng trước khi quyết định chọn món. Hỗ trợ lọc theo số sao (1-5 sao) và phân trang.</w:t>
+      </w:r>
+    </w:p>
+    <w:p>
+      <w:pPr>
+        <w:spacing w:before="20" w:after="40"/>
+        <w:ind w:left="360"/>
+      </w:pPr>
+      <w:r>
+        <w:rPr>
+          <w:b/>
+          <w:color w:val="333333"/>
+        </w:rPr>
+        <w:t xml:space="preserve">• Phân quyền / Header: </w:t>
+      </w:r>
+      <w:r>
+        <w:rPr>
+          <w:color w:val="333333"/>
+        </w:rPr>
+        <w:t>Public / Authenticated</w:t>
+      </w:r>
+    </w:p>
+    <w:p>
+      <w:pPr>
+        <w:spacing w:before="20" w:after="40"/>
+        <w:ind w:left="360"/>
+      </w:pPr>
+      <w:r>
+        <w:rPr>
+          <w:b/>
+          <w:color w:val="333333"/>
+        </w:rPr>
+        <w:t xml:space="preserve">• Tham số (Path / Query Params): </w:t>
+      </w:r>
+      <w:r>
+        <w:rPr>
+          <w:color w:val="333333"/>
+        </w:rPr>
+        <w:t>restaurantId (Long - Mã nhà hàng), page (int - Số trang từ 0), size (int - Số lượng đánh giá mỗi trang, mặc định 10), rating (Integer - Tùy chọn lọc 1-5 sao)</w:t>
+      </w:r>
+    </w:p>
+    <w:p>
+      <w:pPr>
+        <w:spacing w:before="20" w:after="40"/>
+        <w:ind w:left="360"/>
+      </w:pPr>
+      <w:r>
+        <w:rPr>
+          <w:b/>
+          <w:color w:val="333333"/>
+        </w:rPr>
+        <w:t xml:space="preserve">• Kết quả trả về (Response): </w:t>
+      </w:r>
+      <w:r>
+        <w:rPr>
+          <w:color w:val="2E75B6"/>
+        </w:rPr>
+        <w:t>ApiResponse&lt;Page&lt;FoodOrderReviewResponse&gt;&gt; (Danh sách đánh giá phân trang kèm ảnh, bình luận và phản hồi từ quán)</w:t>
       </w:r>
     </w:p>
     <w:p>

</xml_diff>

<commit_message>
update docx for new api endpoint
</commit_message>
<xml_diff>
--- a/DOCUMENT/TỔNG HỢP API MOBILE APP (CUSTOMER & DRIVER).docx
+++ b/DOCUMENT/TỔNG HỢP API MOBILE APP (CUSTOMER & DRIVER).docx
@@ -3034,6 +3034,236 @@
           <w:rFonts w:ascii="Consolas" w:hAnsi="Consolas"/>
         </w:rPr>
         <w:t xml:space="preserve">ApiResponse&lt;List&lt;MenuItemResponse&gt;&gt; (id, name, description, price, imageUrl, isAvailable, category)</w:t>
+      </w:r>
+    </w:p>
+    <w:p>
+      <w:pPr>
+        <w:spacing w:before="240" w:after="60"/>
+      </w:pPr>
+      <w:r>
+        <w:rPr>
+          <w:b/>
+          <w:sz w:val="22"/>
+          <w:color w:val="375623"/>
+          <w:rFonts w:ascii="Arial" w:hAnsi="Arial"/>
+        </w:rPr>
+        <w:t xml:space="preserve">[GET] </w:t>
+      </w:r>
+      <w:r>
+        <w:rPr>
+          <w:b/>
+          <w:sz w:val="22"/>
+          <w:color w:val="000000"/>
+          <w:rFonts w:ascii="Consolas" w:hAnsi="Consolas"/>
+        </w:rPr>
+        <w:t>/api/v1/items/{itemId}</w:t>
+      </w:r>
+    </w:p>
+    <w:p>
+      <w:pPr>
+        <w:ind w:left="360"/>
+        <w:spacing w:before="20" w:after="40"/>
+      </w:pPr>
+      <w:r>
+        <w:rPr>
+          <w:b/>
+          <w:sz w:val="19"/>
+          <w:color w:val="333333"/>
+          <w:rFonts w:ascii="Arial" w:hAnsi="Arial"/>
+        </w:rPr>
+        <w:t xml:space="preserve">• Mô tả: </w:t>
+      </w:r>
+      <w:r>
+        <w:rPr>
+          <w:sz w:val="19"/>
+          <w:color w:val="333333"/>
+          <w:rFonts w:ascii="Arial" w:hAnsi="Arial"/>
+        </w:rPr>
+        <w:t>Lấy thông tin chi tiết một món ăn bằng ID món (dùng khi khách bấm vào món từ banner trang chủ, thông báo khuyến mãi hoặc xem lại từ giỏ hàng mà không cần ID quán).</w:t>
+      </w:r>
+    </w:p>
+    <w:p>
+      <w:pPr>
+        <w:ind w:left="360"/>
+        <w:spacing w:before="20" w:after="40"/>
+      </w:pPr>
+      <w:r>
+        <w:rPr>
+          <w:b/>
+          <w:sz w:val="19"/>
+          <w:color w:val="333333"/>
+          <w:rFonts w:ascii="Arial" w:hAnsi="Arial"/>
+        </w:rPr>
+        <w:t xml:space="preserve">• Phân quyền / Header: </w:t>
+      </w:r>
+      <w:r>
+        <w:rPr>
+          <w:sz w:val="19"/>
+          <w:color w:val="595959"/>
+          <w:rFonts w:ascii="Arial" w:hAnsi="Arial"/>
+        </w:rPr>
+        <w:t>Public / Authenticated</w:t>
+      </w:r>
+    </w:p>
+    <w:p>
+      <w:pPr>
+        <w:ind w:left="360"/>
+        <w:spacing w:before="20" w:after="40"/>
+      </w:pPr>
+      <w:r>
+        <w:rPr>
+          <w:b/>
+          <w:sz w:val="19"/>
+          <w:color w:val="333333"/>
+          <w:rFonts w:ascii="Arial" w:hAnsi="Arial"/>
+        </w:rPr>
+        <w:t xml:space="preserve">• Tham số (Path / Query Params): </w:t>
+      </w:r>
+      <w:r>
+        <w:rPr>
+          <w:sz w:val="19"/>
+          <w:color w:val="595959"/>
+          <w:rFonts w:ascii="Arial" w:hAnsi="Arial"/>
+        </w:rPr>
+        <w:t>itemId (Long - ID món ăn)</w:t>
+      </w:r>
+    </w:p>
+    <w:p>
+      <w:pPr>
+        <w:ind w:left="360"/>
+        <w:spacing w:before="20" w:after="60"/>
+      </w:pPr>
+      <w:r>
+        <w:rPr>
+          <w:b/>
+          <w:sz w:val="19"/>
+          <w:color w:val="333333"/>
+          <w:rFonts w:ascii="Arial" w:hAnsi="Arial"/>
+        </w:rPr>
+        <w:t xml:space="preserve">• Kết quả trả về (Response): </w:t>
+      </w:r>
+      <w:r>
+        <w:rPr>
+          <w:sz w:val="19"/>
+          <w:color w:val="2E75B6"/>
+          <w:rFonts w:ascii="Consolas" w:hAnsi="Consolas"/>
+        </w:rPr>
+        <w:t>ApiResponse&lt;MenuItemResponse&gt; (id, restaurantId, restaurantName, name, description, price, imageUrl, category, isAvailable, createdAt, updatedAt)</w:t>
+      </w:r>
+    </w:p>
+    <w:p>
+      <w:pPr>
+        <w:spacing w:before="240" w:after="60"/>
+      </w:pPr>
+      <w:r>
+        <w:rPr>
+          <w:b/>
+          <w:sz w:val="22"/>
+          <w:color w:val="375623"/>
+          <w:rFonts w:ascii="Arial" w:hAnsi="Arial"/>
+        </w:rPr>
+        <w:t xml:space="preserve">[GET] </w:t>
+      </w:r>
+      <w:r>
+        <w:rPr>
+          <w:b/>
+          <w:sz w:val="22"/>
+          <w:color w:val="000000"/>
+          <w:rFonts w:ascii="Consolas" w:hAnsi="Consolas"/>
+        </w:rPr>
+        <w:t>/api/v1/restaurants/{restaurantId}/items/{itemId}</w:t>
+      </w:r>
+    </w:p>
+    <w:p>
+      <w:pPr>
+        <w:ind w:left="360"/>
+        <w:spacing w:before="20" w:after="40"/>
+      </w:pPr>
+      <w:r>
+        <w:rPr>
+          <w:b/>
+          <w:sz w:val="19"/>
+          <w:color w:val="333333"/>
+          <w:rFonts w:ascii="Arial" w:hAnsi="Arial"/>
+        </w:rPr>
+        <w:t xml:space="preserve">• Mô tả: </w:t>
+      </w:r>
+      <w:r>
+        <w:rPr>
+          <w:sz w:val="19"/>
+          <w:color w:val="333333"/>
+          <w:rFonts w:ascii="Arial" w:hAnsi="Arial"/>
+        </w:rPr>
+        <w:t>Xem thông tin chi tiết món ăn khi đang duyệt thực đơn của một nhà hàng cụ thể (hệ thống kiểm tra chặt chẽ món thuộc đúng nhà hàng, trả về 404 nếu không khớp quán).</w:t>
+      </w:r>
+    </w:p>
+    <w:p>
+      <w:pPr>
+        <w:ind w:left="360"/>
+        <w:spacing w:before="20" w:after="40"/>
+      </w:pPr>
+      <w:r>
+        <w:rPr>
+          <w:b/>
+          <w:sz w:val="19"/>
+          <w:color w:val="333333"/>
+          <w:rFonts w:ascii="Arial" w:hAnsi="Arial"/>
+        </w:rPr>
+        <w:t xml:space="preserve">• Phân quyền / Header: </w:t>
+      </w:r>
+      <w:r>
+        <w:rPr>
+          <w:sz w:val="19"/>
+          <w:color w:val="595959"/>
+          <w:rFonts w:ascii="Arial" w:hAnsi="Arial"/>
+        </w:rPr>
+        <w:t>Public / Authenticated</w:t>
+      </w:r>
+    </w:p>
+    <w:p>
+      <w:pPr>
+        <w:ind w:left="360"/>
+        <w:spacing w:before="20" w:after="40"/>
+      </w:pPr>
+      <w:r>
+        <w:rPr>
+          <w:b/>
+          <w:sz w:val="19"/>
+          <w:color w:val="333333"/>
+          <w:rFonts w:ascii="Arial" w:hAnsi="Arial"/>
+        </w:rPr>
+        <w:t xml:space="preserve">• Tham số (Path / Query Params): </w:t>
+      </w:r>
+      <w:r>
+        <w:rPr>
+          <w:sz w:val="19"/>
+          <w:color w:val="595959"/>
+          <w:rFonts w:ascii="Arial" w:hAnsi="Arial"/>
+        </w:rPr>
+        <w:t>restaurantId (Long - ID nhà hàng), itemId (Long - ID món ăn)</w:t>
+      </w:r>
+    </w:p>
+    <w:p>
+      <w:pPr>
+        <w:ind w:left="360"/>
+        <w:spacing w:before="20" w:after="60"/>
+      </w:pPr>
+      <w:r>
+        <w:rPr>
+          <w:b/>
+          <w:sz w:val="19"/>
+          <w:color w:val="333333"/>
+          <w:rFonts w:ascii="Arial" w:hAnsi="Arial"/>
+        </w:rPr>
+        <w:t xml:space="preserve">• Kết quả trả về (Response): </w:t>
+      </w:r>
+      <w:r>
+        <w:rPr>
+          <w:sz w:val="19"/>
+          <w:color w:val="2E75B6"/>
+          <w:rFonts w:ascii="Consolas" w:hAnsi="Consolas"/>
+        </w:rPr>
+        <w:t>ApiResponse&lt;MenuItemResponse&gt; (id, restaurantId, restaurantName, name, description, price, imageUrl, category, isAvailable, createdAt, updatedAt)</w:t>
       </w:r>
     </w:p>
     <w:p>

</xml_diff>

<commit_message>
feat(booking): add customer and driver avatar URLs to booking and related services
</commit_message>
<xml_diff>
--- a/DOCUMENT/TỔNG HỢP API MOBILE APP (CUSTOMER & DRIVER).docx
+++ b/DOCUMENT/TỔNG HỢP API MOBILE APP (CUSTOMER & DRIVER).docx
@@ -51,6 +51,23 @@
     </w:p>
     <w:p>
       <w:pPr>
+        <w:ind w:left="360"/>
+        <w:keepNext w:val="0"/>
+        <w:keepLines/>
+        <w:spacing w:before="20" w:after="40"/>
+      </w:pPr>
+      <w:r>
+        <w:rPr>
+          <w:b w:val="0"/>
+          <w:sz w:val="19"/>
+          <w:color w:val="333333"/>
+          <w:rFonts w:ascii="Arial" w:hAnsi="Arial"/>
+        </w:rPr>
+        <w:t>Cập nhật ngày 08/10/2026: upload avatar khách/tài xế lên Cloudinary, API xem tài xế theo chuyến và các trường ảnh trong response. Các contract bên dưới mô tả phần backend đã bổ sung.</w:t>
+      </w:r>
+    </w:p>
+    <w:p>
+      <w:pPr>
         <w:spacing w:before="450" w:after="180"/>
         <w:shd w:val="clear" w:color="auto" w:fill="D9E1F2"/>
       </w:pPr>
@@ -255,15 +272,7 @@
           <w:color w:val="333333"/>
           <w:rFonts w:ascii="Arial" w:hAnsi="Arial"/>
         </w:rPr>
-        <w:t xml:space="preserve">• Kết quả trả về (Response): </w:t>
-      </w:r>
-      <w:r>
-        <w:rPr>
-          <w:sz w:val="19"/>
-          <w:color w:val="2E75B6"/>
-          <w:rFonts w:ascii="Consolas" w:hAnsi="Consolas"/>
-        </w:rPr>
-        <w:t xml:space="preserve">LoginResponse (accessToken, refreshToken, user: {id, fullName, phoneNumber, role, email})</w:t>
+        <w:t>• Kết quả trả về: ApiResponse&lt;LoginResponse&gt; (data.accessToken, data.refreshToken, data.user; user có avatarUrl: String/null).</w:t>
       </w:r>
     </w:p>
     <w:p>
@@ -531,15 +540,228 @@
           <w:color w:val="333333"/>
           <w:rFonts w:ascii="Arial" w:hAnsi="Arial"/>
         </w:rPr>
-        <w:t xml:space="preserve">• Kết quả trả về (Response): </w:t>
-      </w:r>
-      <w:r>
-        <w:rPr>
-          <w:sz w:val="19"/>
-          <w:color w:val="2E75B6"/>
-          <w:rFonts w:ascii="Consolas" w:hAnsi="Consolas"/>
-        </w:rPr>
-        <w:t xml:space="preserve">UserResponse (id, fullName, phoneNumber, email, role, status, createdAt)</w:t>
+        <w:t>• Kết quả trả về: ApiResponse&lt;UserResponse&gt;; data gồm id, fullName, phoneNumber, email, role, avatarUrl và các trường hồ sơ khác. avatarUrl null nếu chưa upload.</w:t>
+      </w:r>
+    </w:p>
+    <w:p>
+      <w:pPr>
+        <w:keepNext/>
+        <w:keepLines/>
+        <w:spacing w:before="240" w:after="60"/>
+      </w:pPr>
+      <w:r>
+        <w:rPr>
+          <w:b/>
+          <w:sz w:val="22"/>
+          <w:color w:val="375623"/>
+          <w:rFonts w:ascii="Arial" w:hAnsi="Arial"/>
+        </w:rPr>
+        <w:t>[PUT] /api/v1/users/me/avatar</w:t>
+      </w:r>
+    </w:p>
+    <w:p>
+      <w:pPr>
+        <w:ind w:left="360"/>
+        <w:keepNext w:val="0"/>
+        <w:keepLines/>
+        <w:spacing w:before="20" w:after="40"/>
+      </w:pPr>
+      <w:r>
+        <w:rPr>
+          <w:b w:val="0"/>
+          <w:sz w:val="19"/>
+          <w:color w:val="333333"/>
+          <w:rFonts w:ascii="Arial" w:hAnsi="Arial"/>
+        </w:rPr>
+        <w:t>• Mô tả: Khách hàng và tài xế upload hoặc thay ảnh đại diện của chính mình. Backend upload Cloudinary, lấy secure_url và lưu vào users.avatar_url.</w:t>
+      </w:r>
+    </w:p>
+    <w:p>
+      <w:pPr>
+        <w:ind w:left="360"/>
+        <w:keepNext w:val="0"/>
+        <w:keepLines/>
+        <w:spacing w:before="20" w:after="40"/>
+      </w:pPr>
+      <w:r>
+        <w:rPr>
+          <w:b w:val="0"/>
+          <w:sz w:val="19"/>
+          <w:color w:val="333333"/>
+          <w:rFonts w:ascii="Arial" w:hAnsi="Arial"/>
+        </w:rPr>
+        <w:t>• Quyền / Header: CUSTOMER hoặc DRIVER; Authorization: Bearer &lt;accessToken&gt;. Gateway lấy X-User-Id từ JWT; mobile không truyền ID tài khoản cần sửa.</w:t>
+      </w:r>
+    </w:p>
+    <w:p>
+      <w:pPr>
+        <w:ind w:left="360"/>
+        <w:keepNext w:val="0"/>
+        <w:keepLines/>
+        <w:spacing w:before="20" w:after="40"/>
+      </w:pPr>
+      <w:r>
+        <w:rPr>
+          <w:b w:val="0"/>
+          <w:sz w:val="19"/>
+          <w:color w:val="333333"/>
+          <w:rFonts w:ascii="Arial" w:hAnsi="Arial"/>
+        </w:rPr>
+        <w:t>• Request: multipart/form-data, một part bắt buộc tên file (file nhị phân). Chấp nhận image/jpeg, image/png, image/webp; tối đa 1 MiB (1.048.576 byte). HTTP client tự tạo boundary. Không gửi JSON URL hoặc base64.</w:t>
+      </w:r>
+    </w:p>
+    <w:p>
+      <w:pPr>
+        <w:ind w:left="360"/>
+        <w:keepNext w:val="0"/>
+        <w:keepLines/>
+        <w:spacing w:before="20" w:after="40"/>
+      </w:pPr>
+      <w:r>
+        <w:rPr>
+          <w:b w:val="0"/>
+          <w:sz w:val="19"/>
+          <w:color w:val="333333"/>
+          <w:rFonts w:ascii="Arial" w:hAnsi="Arial"/>
+        </w:rPr>
+        <w:t>• Kết quả: HTTP 200, ApiResponse&lt;UserResponse&gt;; data.avatarUrl là URL ảnh đã lưu. Các trường profile khác vẫn được trả về. Tài khoản chưa có ảnh có avatarUrl = null.</w:t>
+      </w:r>
+    </w:p>
+    <w:p>
+      <w:pPr>
+        <w:ind w:left="360"/>
+        <w:keepNext w:val="0"/>
+        <w:keepLines/>
+        <w:spacing w:before="20" w:after="40"/>
+      </w:pPr>
+      <w:r>
+        <w:rPr>
+          <w:b w:val="0"/>
+          <w:sz w:val="19"/>
+          <w:color w:val="333333"/>
+          <w:rFonts w:ascii="Arial" w:hAnsi="Arial"/>
+        </w:rPr>
+        <w:t>• Mã lỗi: 400 nếu file rỗng/sai MIME hoặc vượt giới hạn khi vào service; 401 nếu token không hợp lệ; 403 nếu sai role; 404 nếu không tìm thấy người dùng; 502 nếu upload thất bại hoặc URL ảnh không hợp lệ. Giới hạn multipart của server có thể từ chối file lớn trước khi vào service.</w:t>
+      </w:r>
+    </w:p>
+    <w:p>
+      <w:pPr>
+        <w:ind w:left="360"/>
+        <w:keepNext w:val="0"/>
+        <w:keepLines/>
+        <w:spacing w:before="20" w:after="40"/>
+      </w:pPr>
+      <w:r>
+        <w:rPr>
+          <w:b w:val="0"/>
+          <w:sz w:val="19"/>
+          <w:color w:val="333333"/>
+          <w:rFonts w:ascii="Arial" w:hAnsi="Arial"/>
+        </w:rPr>
+        <w:t>• Cloudinary: dùng CloudinaryService.uploadImage, thư mục hiện tại omnigo/driver_documents. Thay avatar cập nhật URL trong database; chưa tự xóa ảnh cũ trên Cloudinary. Lỗi upload không ghi đè URL cũ.</w:t>
+      </w:r>
+    </w:p>
+    <w:p>
+      <w:pPr>
+        <w:ind w:left="360"/>
+        <w:keepNext w:val="0"/>
+        <w:keepLines/>
+        <w:spacing w:before="20" w:after="40"/>
+      </w:pPr>
+      <w:r>
+        <w:rPr>
+          <w:b w:val="0"/>
+          <w:sz w:val="19"/>
+          <w:color w:val="333333"/>
+          <w:rFonts w:ascii="Arial" w:hAnsi="Arial"/>
+        </w:rPr>
+        <w:t>• Ví dụ curl (Gateway local):</w:t>
+      </w:r>
+    </w:p>
+    <w:p>
+      <w:pPr>
+        <w:ind w:left="360"/>
+        <w:keepNext w:val="0"/>
+        <w:keepLines/>
+        <w:spacing w:before="20" w:after="40"/>
+      </w:pPr>
+      <w:r>
+        <w:rPr>
+          <w:b w:val="0"/>
+          <w:sz w:val="18"/>
+          <w:color w:val="333333"/>
+          <w:rFonts w:ascii="Consolas" w:hAnsi="Consolas"/>
+        </w:rPr>
+        <w:t>curl -X PUT "http://localhost:8080/api/v1/users/me/avatar"   -H "Authorization: Bearer &lt;accessToken&gt;"   -F "file=@avatar.png;type=image/png"</w:t>
+      </w:r>
+    </w:p>
+    <w:p>
+      <w:pPr>
+        <w:ind w:left="360"/>
+        <w:keepNext w:val="0"/>
+        <w:keepLines/>
+        <w:spacing w:before="20" w:after="40"/>
+      </w:pPr>
+      <w:r>
+        <w:rPr>
+          <w:b w:val="0"/>
+          <w:sz w:val="19"/>
+          <w:color w:val="333333"/>
+          <w:rFonts w:ascii="Arial" w:hAnsi="Arial"/>
+        </w:rPr>
+        <w:t>• Ví dụ phần response liên quan (các trường UserResponse khác lược bớt):</w:t>
+      </w:r>
+    </w:p>
+    <w:p>
+      <w:pPr>
+        <w:ind w:left="360"/>
+        <w:keepNext w:val="0"/>
+        <w:keepLines/>
+        <w:spacing w:before="20" w:after="40"/>
+      </w:pPr>
+      <w:r>
+        <w:rPr>
+          <w:b w:val="0"/>
+          <w:sz w:val="18"/>
+          <w:color w:val="333333"/>
+          <w:rFonts w:ascii="Consolas" w:hAnsi="Consolas"/>
+        </w:rPr>
+        <w:t>{</w:t>
+        <w:br/>
+        <w:t xml:space="preserve">  "success": true,</w:t>
+        <w:br/>
+        <w:t xml:space="preserve">  "message": "Cập nhật ảnh đại diện thành công",</w:t>
+        <w:br/>
+        <w:t xml:space="preserve">  "data": {</w:t>
+        <w:br/>
+        <w:t xml:space="preserve">    "id": 12,</w:t>
+        <w:br/>
+        <w:t xml:space="preserve">    "role": "CUSTOMER",</w:t>
+        <w:br/>
+        <w:t xml:space="preserve">    "avatarUrl": "https://res.cloudinary.com/demo/image/upload/avatar.png"</w:t>
+        <w:br/>
+        <w:t xml:space="preserve">  },</w:t>
+        <w:br/>
+        <w:t xml:space="preserve">  "timestamp": "2026-10-08T10:00:00"</w:t>
+        <w:br/>
+        <w:t>}</w:t>
+      </w:r>
+    </w:p>
+    <w:p>
+      <w:pPr>
+        <w:ind w:left="360"/>
+        <w:keepNext w:val="0"/>
+        <w:keepLines/>
+        <w:spacing w:before="20" w:after="40"/>
+      </w:pPr>
+      <w:r>
+        <w:rPr>
+          <w:b w:val="0"/>
+          <w:sz w:val="19"/>
+          <w:color w:val="333333"/>
+          <w:rFonts w:ascii="Arial" w:hAnsi="Arial"/>
+        </w:rPr>
+        <w:t>• Đọc lại ảnh: GET /api/v1/users/me → data.avatarUrl. Đăng nhập/đăng ký → data.user.avatarUrl. Payload đăng ký giữ nguyên; upload sau khi có token. URL trên chỉ là ví dụ; client dùng URL backend trả về.</w:t>
       </w:r>
     </w:p>
     <w:p>
@@ -2344,15 +2566,422 @@
           <w:color w:val="333333"/>
           <w:rFonts w:ascii="Arial" w:hAnsi="Arial"/>
         </w:rPr>
-        <w:t xml:space="preserve">• Kết quả trả về (Response): </w:t>
-      </w:r>
-      <w:r>
-        <w:rPr>
-          <w:sz w:val="19"/>
-          <w:color w:val="2E75B6"/>
-          <w:rFonts w:ascii="Consolas" w:hAnsi="Consolas"/>
-        </w:rPr>
-        <w:t xml:space="preserve">BookingResponse (id: bookingId, customerId, status: 'PENDING', fare, pickupAddress, dropoffAddress, createdAt)</w:t>
+        <w:t>• Kết quả trả về: BookingResponse trực tiếp (không bọc ApiResponse), gồm bookingId, customerId, driverId, customerAvatarUrl, driverAvatarUrl, startLongitude, startLatitude, endLongitude, endLatitude, status, distanceInKm, price, paymentMethod. Trạng thái: PENDING.</w:t>
+      </w:r>
+    </w:p>
+    <w:p>
+      <w:pPr>
+        <w:keepNext/>
+        <w:keepLines/>
+        <w:spacing w:before="240" w:after="60"/>
+      </w:pPr>
+      <w:r>
+        <w:rPr>
+          <w:b/>
+          <w:sz w:val="22"/>
+          <w:color w:val="375623"/>
+          <w:rFonts w:ascii="Arial" w:hAnsi="Arial"/>
+        </w:rPr>
+        <w:t>[GET] /api/v1/bookings/{bookingId}/driver</w:t>
+      </w:r>
+    </w:p>
+    <w:p>
+      <w:pPr>
+        <w:ind w:left="360"/>
+        <w:keepNext w:val="0"/>
+        <w:keepLines/>
+        <w:spacing w:before="20" w:after="40"/>
+      </w:pPr>
+      <w:r>
+        <w:rPr>
+          <w:b w:val="0"/>
+          <w:sz w:val="19"/>
+          <w:color w:val="333333"/>
+          <w:rFonts w:ascii="Arial" w:hAnsi="Arial"/>
+        </w:rPr>
+        <w:t>• Mô tả: Khách xem thông tin tài xế đang được gán cho chuyến xe của mình. Backend kiểm tra chủ chuyến trước khi gọi user-driver-service; không lấy driverId từ request của mobile.</w:t>
+      </w:r>
+    </w:p>
+    <w:p>
+      <w:pPr>
+        <w:ind w:left="360"/>
+        <w:keepNext w:val="0"/>
+        <w:keepLines/>
+        <w:spacing w:before="20" w:after="40"/>
+      </w:pPr>
+      <w:r>
+        <w:rPr>
+          <w:b w:val="0"/>
+          <w:sz w:val="19"/>
+          <w:color w:val="333333"/>
+          <w:rFonts w:ascii="Arial" w:hAnsi="Arial"/>
+        </w:rPr>
+        <w:t>• Quyền / Header: CUSTOMER; Authorization: Bearer &lt;accessToken&gt;. Path bookingId (Long) là mã chuyến xe, không phải mã đơn đồ ăn.</w:t>
+      </w:r>
+    </w:p>
+    <w:p>
+      <w:pPr>
+        <w:ind w:left="360"/>
+        <w:keepNext w:val="0"/>
+        <w:keepLines/>
+        <w:spacing w:before="20" w:after="40"/>
+      </w:pPr>
+      <w:r>
+        <w:rPr>
+          <w:b w:val="0"/>
+          <w:sz w:val="19"/>
+          <w:color w:val="333333"/>
+          <w:rFonts w:ascii="Arial" w:hAnsi="Arial"/>
+        </w:rPr>
+        <w:t>• Request Body: Không có. Ví dụ: GET /api/v1/bookings/123/driver qua Gateway.</w:t>
+      </w:r>
+    </w:p>
+    <w:p>
+      <w:pPr>
+        <w:ind w:left="360"/>
+        <w:keepNext w:val="0"/>
+        <w:keepLines/>
+        <w:spacing w:before="20" w:after="40"/>
+      </w:pPr>
+      <w:r>
+        <w:rPr>
+          <w:b w:val="0"/>
+          <w:sz w:val="19"/>
+          <w:color w:val="333333"/>
+          <w:rFonts w:ascii="Arial" w:hAnsi="Arial"/>
+        </w:rPr>
+        <w:t>• Kết quả: HTTP 200, ApiResponse&lt;BookingDriverResponse&gt;; data gồm các trường dưới đây.</w:t>
+      </w:r>
+    </w:p>
+    <w:p>
+      <w:pPr>
+        <w:ind w:left="360"/>
+        <w:keepNext w:val="0"/>
+        <w:keepLines/>
+        <w:spacing w:before="20" w:after="40"/>
+      </w:pPr>
+      <w:r>
+        <w:rPr>
+          <w:b w:val="0"/>
+          <w:sz w:val="19"/>
+          <w:color w:val="333333"/>
+          <w:rFonts w:ascii="Arial" w:hAnsi="Arial"/>
+        </w:rPr>
+        <w:t>- driverId: Long — ID tài xế được gán.</w:t>
+      </w:r>
+    </w:p>
+    <w:p>
+      <w:pPr>
+        <w:ind w:left="360"/>
+        <w:keepNext w:val="0"/>
+        <w:keepLines/>
+        <w:spacing w:before="20" w:after="40"/>
+      </w:pPr>
+      <w:r>
+        <w:rPr>
+          <w:b w:val="0"/>
+          <w:sz w:val="19"/>
+          <w:color w:val="333333"/>
+          <w:rFonts w:ascii="Arial" w:hAnsi="Arial"/>
+        </w:rPr>
+        <w:t>- driverName: String/null — tên tài xế, ánh xạ từ fullName.</w:t>
+      </w:r>
+    </w:p>
+    <w:p>
+      <w:pPr>
+        <w:ind w:left="360"/>
+        <w:keepNext w:val="0"/>
+        <w:keepLines/>
+        <w:spacing w:before="20" w:after="40"/>
+      </w:pPr>
+      <w:r>
+        <w:rPr>
+          <w:b w:val="0"/>
+          <w:sz w:val="19"/>
+          <w:color w:val="333333"/>
+          <w:rFonts w:ascii="Arial" w:hAnsi="Arial"/>
+        </w:rPr>
+        <w:t>- driverPhone: String/null — số điện thoại, ánh xạ từ phoneNumber.</w:t>
+      </w:r>
+    </w:p>
+    <w:p>
+      <w:pPr>
+        <w:ind w:left="360"/>
+        <w:keepNext w:val="0"/>
+        <w:keepLines/>
+        <w:spacing w:before="20" w:after="40"/>
+      </w:pPr>
+      <w:r>
+        <w:rPr>
+          <w:b w:val="0"/>
+          <w:sz w:val="19"/>
+          <w:color w:val="333333"/>
+          <w:rFonts w:ascii="Arial" w:hAnsi="Arial"/>
+        </w:rPr>
+        <w:t>- vehiclePlate: String/null — biển số, ánh xạ từ licensePlate.</w:t>
+      </w:r>
+    </w:p>
+    <w:p>
+      <w:pPr>
+        <w:ind w:left="360"/>
+        <w:keepNext w:val="0"/>
+        <w:keepLines/>
+        <w:spacing w:before="20" w:after="40"/>
+      </w:pPr>
+      <w:r>
+        <w:rPr>
+          <w:b w:val="0"/>
+          <w:sz w:val="19"/>
+          <w:color w:val="333333"/>
+          <w:rFonts w:ascii="Arial" w:hAnsi="Arial"/>
+        </w:rPr>
+        <w:t>- vehicleType, vehicleModel: String/null — loại xe và mẫu xe.</w:t>
+      </w:r>
+    </w:p>
+    <w:p>
+      <w:pPr>
+        <w:ind w:left="360"/>
+        <w:keepNext w:val="0"/>
+        <w:keepLines/>
+        <w:spacing w:before="20" w:after="40"/>
+      </w:pPr>
+      <w:r>
+        <w:rPr>
+          <w:b w:val="0"/>
+          <w:sz w:val="19"/>
+          <w:color w:val="333333"/>
+          <w:rFonts w:ascii="Arial" w:hAnsi="Arial"/>
+        </w:rPr>
+        <w:t>- avatarUrl: String/null — URL avatar hiện tại của tài xế; null nếu chưa upload.</w:t>
+      </w:r>
+    </w:p>
+    <w:p>
+      <w:pPr>
+        <w:ind w:left="360"/>
+        <w:keepNext w:val="0"/>
+        <w:keepLines/>
+        <w:spacing w:before="20" w:after="40"/>
+      </w:pPr>
+      <w:r>
+        <w:rPr>
+          <w:b w:val="0"/>
+          <w:sz w:val="19"/>
+          <w:color w:val="333333"/>
+          <w:rFonts w:ascii="Arial" w:hAnsi="Arial"/>
+        </w:rPr>
+        <w:t>• Không trả CCCD, GPLX, email, trạng thái khóa/duyệt tài khoản; chưa có rating trong response này.</w:t>
+      </w:r>
+    </w:p>
+    <w:p>
+      <w:pPr>
+        <w:ind w:left="360"/>
+        <w:keepNext w:val="0"/>
+        <w:keepLines/>
+        <w:spacing w:before="20" w:after="40"/>
+      </w:pPr>
+      <w:r>
+        <w:rPr>
+          <w:b w:val="0"/>
+          <w:sz w:val="19"/>
+          <w:color w:val="333333"/>
+          <w:rFonts w:ascii="Arial" w:hAnsi="Arial"/>
+        </w:rPr>
+        <w:t>• Mã lỗi: 401 nếu token thiếu/sai/hết hạn; 403 nếu sai role hoặc chuyến thuộc khách khác; 404 nếu không có chuyến hoặc chưa gán tài xế; 502 nếu dịch vụ hồ sơ lỗi hoặc trả dữ liệu không hợp lệ.</w:t>
+      </w:r>
+    </w:p>
+    <w:p>
+      <w:pPr>
+        <w:ind w:left="360"/>
+        <w:keepNext w:val="0"/>
+        <w:keepLines/>
+        <w:spacing w:before="20" w:after="40"/>
+      </w:pPr>
+      <w:r>
+        <w:rPr>
+          <w:b w:val="0"/>
+          <w:sz w:val="19"/>
+          <w:color w:val="333333"/>
+          <w:rFonts w:ascii="Arial" w:hAnsi="Arial"/>
+        </w:rPr>
+        <w:t>• Ví dụ response (giá trị minh họa):</w:t>
+      </w:r>
+    </w:p>
+    <w:p>
+      <w:pPr>
+        <w:ind w:left="360"/>
+        <w:keepNext w:val="0"/>
+        <w:keepLines/>
+        <w:spacing w:before="20" w:after="40"/>
+      </w:pPr>
+      <w:r>
+        <w:rPr>
+          <w:b w:val="0"/>
+          <w:sz w:val="18"/>
+          <w:color w:val="333333"/>
+          <w:rFonts w:ascii="Consolas" w:hAnsi="Consolas"/>
+        </w:rPr>
+        <w:t>{</w:t>
+        <w:br/>
+        <w:t xml:space="preserve">  "success": true,</w:t>
+        <w:br/>
+        <w:t xml:space="preserve">  "message": "Lấy thông tin tài xế thành công",</w:t>
+        <w:br/>
+        <w:t xml:space="preserve">  "data": {</w:t>
+        <w:br/>
+        <w:t xml:space="preserve">    "driverId": 3,</w:t>
+        <w:br/>
+        <w:t xml:space="preserve">    "driverName": "Nguyễn Văn A",</w:t>
+        <w:br/>
+        <w:t xml:space="preserve">    "driverPhone": "0901234567",</w:t>
+        <w:br/>
+        <w:t xml:space="preserve">    "vehiclePlate": "59-A1-12345",</w:t>
+        <w:br/>
+        <w:t xml:space="preserve">    "vehicleType": "BIKE",</w:t>
+        <w:br/>
+        <w:t xml:space="preserve">    "vehicleModel": "Honda Wave",</w:t>
+        <w:br/>
+        <w:t xml:space="preserve">    "avatarUrl": "https://res.cloudinary.com/demo/image/upload/driver.png"</w:t>
+        <w:br/>
+        <w:t xml:space="preserve">  },</w:t>
+        <w:br/>
+        <w:t xml:space="preserve">  "timestamp": "2026-10-08T10:00:00"</w:t>
+        <w:br/>
+        <w:t>}</w:t>
+      </w:r>
+    </w:p>
+    <w:p>
+      <w:pPr>
+        <w:ind w:left="360"/>
+        <w:keepNext w:val="0"/>
+        <w:keepLines/>
+        <w:spacing w:before="20" w:after="40"/>
+      </w:pPr>
+      <w:r>
+        <w:rPr>
+          <w:b w:val="0"/>
+          <w:sz w:val="19"/>
+          <w:color w:val="333333"/>
+          <w:rFonts w:ascii="Arial" w:hAnsi="Arial"/>
+        </w:rPr>
+        <w:t>• Thời điểm gọi: Sau khi /user/queue/booking/status báo có tài xế. STOMP chỉ có BookingResponse, không có toàn bộ profile. Nếu tài xế hủy và chuyến quay về PENDING, xóa thẻ tài xế cũ; gọi lại API sau lần gán mới. 404 trong lúc chưa có tài xế là dự kiến.</w:t>
+      </w:r>
+    </w:p>
+    <w:p>
+      <w:pPr>
+        <w:ind w:left="360"/>
+        <w:keepNext w:val="0"/>
+        <w:keepLines/>
+        <w:spacing w:before="20" w:after="40"/>
+      </w:pPr>
+      <w:r>
+        <w:rPr>
+          <w:b w:val="0"/>
+          <w:sz w:val="19"/>
+          <w:color w:val="333333"/>
+          <w:rFonts w:ascii="Arial" w:hAnsi="Arial"/>
+        </w:rPr>
+        <w:t>• Chuyến đã kết thúc vẫn xem được nếu thuộc khách và còn driverId. API trả hồ sơ hiện tại, không phải thông tin chụp tại lúc đặt chuyến.</w:t>
+      </w:r>
+    </w:p>
+    <w:p>
+      <w:pPr>
+        <w:keepNext/>
+        <w:keepLines/>
+        <w:spacing w:before="240" w:after="60"/>
+      </w:pPr>
+      <w:r>
+        <w:rPr>
+          <w:b/>
+          <w:sz w:val="22"/>
+          <w:color w:val="375623"/>
+          <w:rFonts w:ascii="Arial" w:hAnsi="Arial"/>
+        </w:rPr>
+        <w:t>Avatar trong response chuyến xe</w:t>
+      </w:r>
+    </w:p>
+    <w:p>
+      <w:pPr>
+        <w:ind w:left="360"/>
+        <w:keepNext w:val="0"/>
+        <w:keepLines/>
+        <w:spacing w:before="20" w:after="40"/>
+      </w:pPr>
+      <w:r>
+        <w:rPr>
+          <w:b w:val="0"/>
+          <w:sz w:val="19"/>
+          <w:color w:val="333333"/>
+          <w:rFonts w:ascii="Arial" w:hAnsi="Arial"/>
+        </w:rPr>
+        <w:t>• BookingResponse thêm customerAvatarUrl và driverAvatarUrl (String/null). Khách có ảnh được lưu lúc tạo chuyến; tài xế có ảnh được lưu lúc nhận chuyến. Lịch sử GET /api/v1/bookings/customer trả ApiResponse&lt;List&lt;Booking&gt;&gt;, cũng có hai trường này trong data[i].</w:t>
+      </w:r>
+    </w:p>
+    <w:p>
+      <w:pPr>
+        <w:ind w:left="360"/>
+        <w:keepNext w:val="0"/>
+        <w:keepLines/>
+        <w:spacing w:before="20" w:after="40"/>
+      </w:pPr>
+      <w:r>
+        <w:rPr>
+          <w:b w:val="0"/>
+          <w:sz w:val="19"/>
+          <w:color w:val="333333"/>
+          <w:rFonts w:ascii="Arial" w:hAnsi="Arial"/>
+        </w:rPr>
+        <w:t>• Tài xế đọc customerAvatarUrl trong /user/queue/driver/match. Khách theo dõi /user/queue/booking/status. Các payload BookingResponse có hai trường ảnh trực tiếp, không bọc trong data; API profile tài xế thì có data.avatarUrl.</w:t>
+      </w:r>
+    </w:p>
+    <w:p>
+      <w:pPr>
+        <w:ind w:left="360"/>
+        <w:keepNext w:val="0"/>
+        <w:keepLines/>
+        <w:spacing w:before="20" w:after="40"/>
+      </w:pPr>
+      <w:r>
+        <w:rPr>
+          <w:b w:val="0"/>
+          <w:sz w:val="19"/>
+          <w:color w:val="333333"/>
+          <w:rFonts w:ascii="Arial" w:hAnsi="Arial"/>
+        </w:rPr>
+        <w:t>• Khi tài xế hủy để tìm người thay thế, driverId và driverAvatarUrl trong chuyến bị xóa; ảnh khách được giữ. Chuyến cũ hoặc lần lấy avatar lỗi có thể trả null. Mobile dùng ảnh mặc định khi null hoặc ảnh không tải được.</w:t>
+      </w:r>
+    </w:p>
+    <w:p>
+      <w:pPr>
+        <w:ind w:left="360"/>
+        <w:keepNext w:val="0"/>
+        <w:keepLines/>
+        <w:spacing w:before="20" w:after="40"/>
+      </w:pPr>
+      <w:r>
+        <w:rPr>
+          <w:b w:val="0"/>
+          <w:sz w:val="19"/>
+          <w:color w:val="333333"/>
+          <w:rFonts w:ascii="Arial" w:hAnsi="Arial"/>
+        </w:rPr>
+        <w:t>• Đổi ảnh trong hồ sơ không tự đổi ảnh đã lưu trong chuyến. API /bookings/{bookingId}/driver trả avatarUrl hiện tại nên có thể khác driverAvatarUrl trong chuyến.</w:t>
+      </w:r>
+    </w:p>
+    <w:p>
+      <w:pPr>
+        <w:ind w:left="360"/>
+        <w:keepNext w:val="0"/>
+        <w:keepLines/>
+        <w:spacing w:before="20" w:after="40"/>
+      </w:pPr>
+      <w:r>
+        <w:rPr>
+          <w:b w:val="0"/>
+          <w:sz w:val="19"/>
+          <w:color w:val="333333"/>
+          <w:rFonts w:ascii="Arial" w:hAnsi="Arial"/>
+        </w:rPr>
+        <w:t>• Những bổ sung này áp dụng cho OmniRide; chưa bổ sung hồ sơ tài xế/avatar vào FoodOrderResponse hoặc triển khai realtime GPS.</w:t>
       </w:r>
     </w:p>
     <w:p>
@@ -2459,15 +3088,7 @@
           <w:color w:val="333333"/>
           <w:rFonts w:ascii="Arial" w:hAnsi="Arial"/>
         </w:rPr>
-        <w:t xml:space="preserve">• Kết quả trả về (Response): </w:t>
-      </w:r>
-      <w:r>
-        <w:rPr>
-          <w:sz w:val="19"/>
-          <w:color w:val="2E75B6"/>
-          <w:rFonts w:ascii="Consolas" w:hAnsi="Consolas"/>
-        </w:rPr>
-        <w:t xml:space="preserve">BookingResponse (status: 'CANCELLED')</w:t>
+        <w:t>• Kết quả trả về: BookingResponse trực tiếp (không bọc ApiResponse), gồm bookingId, customerId, driverId, customerAvatarUrl, driverAvatarUrl, startLongitude, startLatitude, endLongitude, endLatitude, status, distanceInKm, price, paymentMethod. Trạng thái: CANCELLED.</w:t>
       </w:r>
     </w:p>
     <w:p>
@@ -2551,15 +3172,7 @@
           <w:color w:val="333333"/>
           <w:rFonts w:ascii="Arial" w:hAnsi="Arial"/>
         </w:rPr>
-        <w:t xml:space="preserve">• Kết quả trả về (Response): </w:t>
-      </w:r>
-      <w:r>
-        <w:rPr>
-          <w:sz w:val="19"/>
-          <w:color w:val="2E75B6"/>
-          <w:rFonts w:ascii="Consolas" w:hAnsi="Consolas"/>
-        </w:rPr>
-        <w:t xml:space="preserve">ApiResponse&lt;List&lt;Booking&gt;&gt; (Danh sách đầy đủ các cuốc xe theo thời gian mới nhất)</w:t>
+        <w:t>• Kết quả trả về: ApiResponse&lt;List&lt;Booking&gt;&gt;; data[i] gồm id, customerId, driverId, customerAvatarUrl, driverAvatarUrl và các trường chuyến xe khác.</w:t>
       </w:r>
     </w:p>
     <w:p>
@@ -5342,15 +5955,7 @@
           <w:color w:val="333333"/>
           <w:rFonts w:ascii="Arial" w:hAnsi="Arial"/>
         </w:rPr>
-        <w:t xml:space="preserve">• Kết quả trả về (Response): </w:t>
-      </w:r>
-      <w:r>
-        <w:rPr>
-          <w:sz w:val="19"/>
-          <w:color w:val="2E75B6"/>
-          <w:rFonts w:ascii="Consolas" w:hAnsi="Consolas"/>
-        </w:rPr>
-        <w:t xml:space="preserve">ApiResponse&lt;UserResponse&gt; (Hồ sơ tài xế, thông tin xe, giấy phép, trạng thái duyệt)</w:t>
+        <w:t>• Kết quả trả về (Response): ApiResponse&lt;UserResponse&gt; (Hồ sơ tài xế, thông tin xe, giấy phép, trạng thái duyệt) Bổ sung avatarUrl: String/null trong hồ sơ.</w:t>
       </w:r>
     </w:p>
     <w:p>
@@ -5568,15 +6173,7 @@
           <w:color w:val="333333"/>
           <w:rFonts w:ascii="Arial" w:hAnsi="Arial"/>
         </w:rPr>
-        <w:t xml:space="preserve">• Kết quả trả về (Response): </w:t>
-      </w:r>
-      <w:r>
-        <w:rPr>
-          <w:sz w:val="19"/>
-          <w:color w:val="2E75B6"/>
-          <w:rFonts w:ascii="Consolas" w:hAnsi="Consolas"/>
-        </w:rPr>
-        <w:t xml:space="preserve">ApiResponse&lt;UserResponse&gt; (Hồ sơ tài xế sau khi cập nhật phương tiện)</w:t>
+        <w:t>• Kết quả trả về (Response): ApiResponse&lt;UserResponse&gt; (Hồ sơ tài xế sau khi cập nhật phương tiện) Bổ sung avatarUrl: String/null trong hồ sơ.</w:t>
       </w:r>
     </w:p>
     <w:p>
@@ -5890,15 +6487,7 @@
           <w:color w:val="333333"/>
           <w:rFonts w:ascii="Arial" w:hAnsi="Arial"/>
         </w:rPr>
-        <w:t xml:space="preserve">• Kết quả trả về (Response): </w:t>
-      </w:r>
-      <w:r>
-        <w:rPr>
-          <w:sz w:val="19"/>
-          <w:color w:val="2E75B6"/>
-          <w:rFonts w:ascii="Consolas" w:hAnsi="Consolas"/>
-        </w:rPr>
-        <w:t xml:space="preserve">ApiResponse&lt;UserResponse&gt; (Trạng thái chuyển về PENDING_APPROVAL để Admin duyệt lại)</w:t>
+        <w:t>• Kết quả trả về (Response): ApiResponse&lt;UserResponse&gt; (Trạng thái chuyển về PENDING_APPROVAL để Admin duyệt lại) Bổ sung avatarUrl: String/null trong hồ sơ.</w:t>
       </w:r>
     </w:p>
     <w:p>
@@ -6383,15 +6972,7 @@
           <w:color w:val="333333"/>
           <w:rFonts w:ascii="Arial" w:hAnsi="Arial"/>
         </w:rPr>
-        <w:t xml:space="preserve">• Kết quả trả về (Response): </w:t>
-      </w:r>
-      <w:r>
-        <w:rPr>
-          <w:sz w:val="19"/>
-          <w:color w:val="2E75B6"/>
-          <w:rFonts w:ascii="Consolas" w:hAnsi="Consolas"/>
-        </w:rPr>
-        <w:t xml:space="preserve">BookingResponse (status: 'ACCEPTED', driverId, customerId, fare, pickupAddress, dropoffAddress)</w:t>
+        <w:t>• Kết quả trả về: BookingResponse trực tiếp (không bọc ApiResponse), gồm bookingId, customerId, driverId, customerAvatarUrl, driverAvatarUrl, startLongitude, startLatitude, endLongitude, endLatitude, status, distanceInKm, price, paymentMethod. Trạng thái: ACCEPTED.</w:t>
       </w:r>
     </w:p>
     <w:p>
@@ -6498,15 +7079,7 @@
           <w:color w:val="333333"/>
           <w:rFonts w:ascii="Arial" w:hAnsi="Arial"/>
         </w:rPr>
-        <w:t xml:space="preserve">• Kết quả trả về (Response): </w:t>
-      </w:r>
-      <w:r>
-        <w:rPr>
-          <w:sz w:val="19"/>
-          <w:color w:val="2E75B6"/>
-          <w:rFonts w:ascii="Consolas" w:hAnsi="Consolas"/>
-        </w:rPr>
-        <w:t xml:space="preserve">BookingResponse (status: 'ARRIVED')</w:t>
+        <w:t>• Kết quả trả về: BookingResponse trực tiếp (không bọc ApiResponse), gồm bookingId, customerId, driverId, customerAvatarUrl, driverAvatarUrl, startLongitude, startLatitude, endLongitude, endLatitude, status, distanceInKm, price, paymentMethod. Trạng thái: ARRIVED.</w:t>
       </w:r>
     </w:p>
     <w:p>
@@ -6613,15 +7186,7 @@
           <w:color w:val="333333"/>
           <w:rFonts w:ascii="Arial" w:hAnsi="Arial"/>
         </w:rPr>
-        <w:t xml:space="preserve">• Kết quả trả về (Response): </w:t>
-      </w:r>
-      <w:r>
-        <w:rPr>
-          <w:sz w:val="19"/>
-          <w:color w:val="2E75B6"/>
-          <w:rFonts w:ascii="Consolas" w:hAnsi="Consolas"/>
-        </w:rPr>
-        <w:t xml:space="preserve">BookingResponse (status: 'IN_PROGRESS')</w:t>
+        <w:t>• Kết quả trả về: BookingResponse trực tiếp (không bọc ApiResponse), gồm bookingId, customerId, driverId, customerAvatarUrl, driverAvatarUrl, startLongitude, startLatitude, endLongitude, endLatitude, status, distanceInKm, price, paymentMethod. Trạng thái: IN_PROGRESS.</w:t>
       </w:r>
     </w:p>
     <w:p>
@@ -6728,15 +7293,7 @@
           <w:color w:val="333333"/>
           <w:rFonts w:ascii="Arial" w:hAnsi="Arial"/>
         </w:rPr>
-        <w:t xml:space="preserve">• Kết quả trả về (Response): </w:t>
-      </w:r>
-      <w:r>
-        <w:rPr>
-          <w:sz w:val="19"/>
-          <w:color w:val="2E75B6"/>
-          <w:rFonts w:ascii="Consolas" w:hAnsi="Consolas"/>
-        </w:rPr>
-        <w:t xml:space="preserve">BookingResponse (status: 'COMPLETED', completedAt, fare)</w:t>
+        <w:t>• Kết quả trả về: BookingResponse trực tiếp (không bọc ApiResponse), gồm bookingId, customerId, driverId, customerAvatarUrl, driverAvatarUrl, startLongitude, startLatitude, endLongitude, endLatitude, status, distanceInKm, price, paymentMethod. Trạng thái: COMPLETED.</w:t>
       </w:r>
     </w:p>
     <w:p>
@@ -6843,15 +7400,7 @@
           <w:color w:val="333333"/>
           <w:rFonts w:ascii="Arial" w:hAnsi="Arial"/>
         </w:rPr>
-        <w:t xml:space="preserve">• Kết quả trả về (Response): </w:t>
-      </w:r>
-      <w:r>
-        <w:rPr>
-          <w:sz w:val="19"/>
-          <w:color w:val="2E75B6"/>
-          <w:rFonts w:ascii="Consolas" w:hAnsi="Consolas"/>
-        </w:rPr>
-        <w:t xml:space="preserve">BookingResponse (status: 'CANCELLED')</w:t>
+        <w:t>• Kết quả trả về: BookingResponse trực tiếp (không bọc ApiResponse), gồm bookingId, customerId, driverId, customerAvatarUrl, driverAvatarUrl, startLongitude, startLatitude, endLongitude, endLatitude, status, distanceInKm, price, paymentMethod. Tài xế hủy chuyến đã nhận để tìm người thay thế: status PENDING, driverId và driverAvatarUrl null.</w:t>
       </w:r>
     </w:p>
     <w:p>
@@ -7740,6 +8289,81 @@
           <w:color w:val="008080"/>
           <w:rFonts w:ascii="Arial" w:hAnsi="Arial"/>
         </w:rPr>
+        <w:t>[STOMP] /user/queue/driver/match</w:t>
+      </w:r>
+    </w:p>
+    <w:p>
+      <w:pPr>
+        <w:ind w:left="360"/>
+        <w:spacing w:before="20" w:after="40"/>
+      </w:pPr>
+      <w:r>
+        <w:rPr>
+          <w:b/>
+          <w:sz w:val="19"/>
+          <w:color w:val="333333"/>
+          <w:rFonts w:ascii="Arial" w:hAnsi="Arial"/>
+        </w:rPr>
+        <w:t xml:space="preserve">• Mô tả: </w:t>
+      </w:r>
+      <w:r>
+        <w:rPr>
+          <w:sz w:val="19"/>
+          <w:color w:val="333333"/>
+          <w:rFonts w:ascii="Arial" w:hAnsi="Arial"/>
+        </w:rPr>
+        <w:t xml:space="preserve">[DÀNH CHO TÀI XẾ] Lắng nghe lời mời cuốc xe chở khách mới gần vị trí của tài xế (thời gian đếm ngược nhận cuốc 20 giây).</w:t>
+      </w:r>
+    </w:p>
+    <w:p>
+      <w:pPr>
+        <w:ind w:left="360"/>
+        <w:spacing w:before="20" w:after="40"/>
+      </w:pPr>
+      <w:r>
+        <w:rPr>
+          <w:b/>
+          <w:sz w:val="19"/>
+          <w:color w:val="333333"/>
+          <w:rFonts w:ascii="Arial" w:hAnsi="Arial"/>
+        </w:rPr>
+        <w:t xml:space="preserve">• Phân quyền / Header: </w:t>
+      </w:r>
+      <w:r>
+        <w:rPr>
+          <w:sz w:val="19"/>
+          <w:color w:val="595959"/>
+          <w:rFonts w:ascii="Arial" w:hAnsi="Arial"/>
+        </w:rPr>
+        <w:t xml:space="preserve">Khách hàng kết nối gửi Header userId: &lt;driverId&gt;</w:t>
+      </w:r>
+    </w:p>
+    <w:p>
+      <w:pPr>
+        <w:ind w:left="360"/>
+        <w:spacing w:before="20" w:after="60"/>
+      </w:pPr>
+      <w:r>
+        <w:rPr>
+          <w:b/>
+          <w:sz w:val="19"/>
+          <w:color w:val="333333"/>
+          <w:rFonts w:ascii="Arial" w:hAnsi="Arial"/>
+        </w:rPr>
+        <w:t>• Kết quả trả về: BookingResponse (bookingId, customerId, driverId, customerAvatarUrl, driverAvatarUrl, tọa độ, status, distanceInKm, price, paymentMethod). Tài xế dùng customerAvatarUrl để hiển thị ảnh khách.</w:t>
+      </w:r>
+    </w:p>
+    <w:p>
+      <w:pPr>
+        <w:spacing w:before="240" w:after="60"/>
+      </w:pPr>
+      <w:r>
+        <w:rPr>
+          <w:b/>
+          <w:sz w:val="22"/>
+          <w:color w:val="008080"/>
+          <w:rFonts w:ascii="Arial" w:hAnsi="Arial"/>
+        </w:rPr>
         <w:t xml:space="preserve">[STOMP] </w:t>
       </w:r>
       <w:r>
@@ -7749,7 +8373,7 @@
           <w:color w:val="000000"/>
           <w:rFonts w:ascii="Consolas" w:hAnsi="Consolas"/>
         </w:rPr>
-        <w:t xml:space="preserve">/user/queue/ride-offers</w:t>
+        <w:t xml:space="preserve">/user/queue/food-offers</w:t>
       </w:r>
     </w:p>
     <w:p>
@@ -7772,7 +8396,7 @@
           <w:color w:val="333333"/>
           <w:rFonts w:ascii="Arial" w:hAnsi="Arial"/>
         </w:rPr>
-        <w:t xml:space="preserve">[DÀNH CHO TÀI XẾ] Lắng nghe lời mời cuốc xe chở khách mới gần vị trí của tài xế (thời gian đếm ngược nhận cuốc 20 giây).</w:t>
+        <w:t xml:space="preserve">[DÀNH CHO TÀI XẾ] Lắng nghe thông báo mời nhận giao đơn đồ ăn từ nhà hàng gần vị trí của tài xế.</w:t>
       </w:r>
     </w:p>
     <w:p>
@@ -7818,7 +8442,7 @@
           <w:color w:val="2E75B6"/>
           <w:rFonts w:ascii="Consolas" w:hAnsi="Consolas"/>
         </w:rPr>
-        <w:t xml:space="preserve">RideOfferMessage (bookingId, pickupAddress, dropoffAddress, pickupLat, pickupLng, dropoffLat, dropoffLng, fare, distanceKm, countdownSeconds: 20)</w:t>
+        <w:t xml:space="preserve">FoodOfferMessage (orderId, restaurantName, restaurantAddress, dropOffAddress, deliveryFee, totalPrice)</w:t>
       </w:r>
     </w:p>
     <w:p>
@@ -7832,62 +8456,52 @@
           <w:color w:val="008080"/>
           <w:rFonts w:ascii="Arial" w:hAnsi="Arial"/>
         </w:rPr>
-        <w:t xml:space="preserve">[STOMP] </w:t>
-      </w:r>
-      <w:r>
-        <w:rPr>
-          <w:b/>
-          <w:sz w:val="22"/>
-          <w:color w:val="000000"/>
-          <w:rFonts w:ascii="Consolas" w:hAnsi="Consolas"/>
-        </w:rPr>
-        <w:t xml:space="preserve">/user/queue/food-offers</w:t>
-      </w:r>
-    </w:p>
-    <w:p>
-      <w:pPr>
-        <w:ind w:left="360"/>
-        <w:spacing w:before="20" w:after="40"/>
-      </w:pPr>
-      <w:r>
-        <w:rPr>
-          <w:b/>
-          <w:sz w:val="19"/>
-          <w:color w:val="333333"/>
-          <w:rFonts w:ascii="Arial" w:hAnsi="Arial"/>
-        </w:rPr>
-        <w:t xml:space="preserve">• Mô tả: </w:t>
-      </w:r>
-      <w:r>
-        <w:rPr>
-          <w:sz w:val="19"/>
-          <w:color w:val="333333"/>
-          <w:rFonts w:ascii="Arial" w:hAnsi="Arial"/>
-        </w:rPr>
-        <w:t xml:space="preserve">[DÀNH CHO TÀI XẾ] Lắng nghe thông báo mời nhận giao đơn đồ ăn từ nhà hàng gần vị trí của tài xế.</w:t>
-      </w:r>
-    </w:p>
-    <w:p>
-      <w:pPr>
-        <w:ind w:left="360"/>
-        <w:spacing w:before="20" w:after="40"/>
-      </w:pPr>
-      <w:r>
-        <w:rPr>
-          <w:b/>
-          <w:sz w:val="19"/>
-          <w:color w:val="333333"/>
-          <w:rFonts w:ascii="Arial" w:hAnsi="Arial"/>
-        </w:rPr>
-        <w:t xml:space="preserve">• Phân quyền / Header: </w:t>
-      </w:r>
-      <w:r>
-        <w:rPr>
-          <w:sz w:val="19"/>
-          <w:color w:val="595959"/>
-          <w:rFonts w:ascii="Arial" w:hAnsi="Arial"/>
-        </w:rPr>
-        <w:t xml:space="preserve">Khách hàng kết nối gửi Header userId: &lt;driverId&gt;</w:t>
+        <w:t>[STOMP] /user/queue/booking/status</w:t>
+      </w:r>
+    </w:p>
+    <w:p>
+      <w:pPr>
+        <w:ind w:left="360"/>
+        <w:spacing w:before="20" w:after="40"/>
+      </w:pPr>
+      <w:r>
+        <w:rPr>
+          <w:b/>
+          <w:sz w:val="19"/>
+          <w:color w:val="333333"/>
+          <w:rFonts w:ascii="Arial" w:hAnsi="Arial"/>
+        </w:rPr>
+        <w:t>• Mô tả: Kênh riêng của khách nhận cập nhật trạng thái chuyến xe; lấy profile tài xế bằng GET /api/v1/bookings/{bookingId}/driver.</w:t>
+      </w:r>
+    </w:p>
+    <w:p>
+      <w:pPr>
+        <w:ind w:left="360"/>
+        <w:spacing w:before="20" w:after="40"/>
+      </w:pPr>
+      <w:r>
+        <w:rPr>
+          <w:b/>
+          <w:sz w:val="19"/>
+          <w:color w:val="333333"/>
+          <w:rFonts w:ascii="Arial" w:hAnsi="Arial"/>
+        </w:rPr>
+        <w:t>• Định tuyến: User destination theo customerId của khách, không phải topic công khai theo bookingId.</w:t>
+      </w:r>
+    </w:p>
+    <w:p>
+      <w:pPr>
+        <w:ind w:left="360"/>
+        <w:spacing w:before="20" w:after="40"/>
+      </w:pPr>
+      <w:r>
+        <w:rPr>
+          <w:b/>
+          <w:sz w:val="19"/>
+          <w:color w:val="333333"/>
+          <w:rFonts w:ascii="Arial" w:hAnsi="Arial"/>
+        </w:rPr>
+        <w:t>• Không truyền bookingId trong đường dẫn subscribe; đọc bookingId từ payload.</w:t>
       </w:r>
     </w:p>
     <w:p>
@@ -7902,130 +8516,7 @@
           <w:color w:val="333333"/>
           <w:rFonts w:ascii="Arial" w:hAnsi="Arial"/>
         </w:rPr>
-        <w:t xml:space="preserve">• Kết quả trả về (Response): </w:t>
-      </w:r>
-      <w:r>
-        <w:rPr>
-          <w:sz w:val="19"/>
-          <w:color w:val="2E75B6"/>
-          <w:rFonts w:ascii="Consolas" w:hAnsi="Consolas"/>
-        </w:rPr>
-        <w:t xml:space="preserve">FoodOfferMessage (orderId, restaurantName, restaurantAddress, dropOffAddress, deliveryFee, totalPrice)</w:t>
-      </w:r>
-    </w:p>
-    <w:p>
-      <w:pPr>
-        <w:spacing w:before="240" w:after="60"/>
-      </w:pPr>
-      <w:r>
-        <w:rPr>
-          <w:b/>
-          <w:sz w:val="22"/>
-          <w:color w:val="008080"/>
-          <w:rFonts w:ascii="Arial" w:hAnsi="Arial"/>
-        </w:rPr>
-        <w:t xml:space="preserve">[STOMP] </w:t>
-      </w:r>
-      <w:r>
-        <w:rPr>
-          <w:b/>
-          <w:sz w:val="22"/>
-          <w:color w:val="000000"/>
-          <w:rFonts w:ascii="Consolas" w:hAnsi="Consolas"/>
-        </w:rPr>
-        <w:t xml:space="preserve">/topic/booking/{bookingId}</w:t>
-      </w:r>
-    </w:p>
-    <w:p>
-      <w:pPr>
-        <w:ind w:left="360"/>
-        <w:spacing w:before="20" w:after="40"/>
-      </w:pPr>
-      <w:r>
-        <w:rPr>
-          <w:b/>
-          <w:sz w:val="19"/>
-          <w:color w:val="333333"/>
-          <w:rFonts w:ascii="Arial" w:hAnsi="Arial"/>
-        </w:rPr>
-        <w:t xml:space="preserve">• Mô tả: </w:t>
-      </w:r>
-      <w:r>
-        <w:rPr>
-          <w:sz w:val="19"/>
-          <w:color w:val="333333"/>
-          <w:rFonts w:ascii="Arial" w:hAnsi="Arial"/>
-        </w:rPr>
-        <w:t xml:space="preserve">[DÀNH CHO KHÁCH HÀNG &amp; TÀI XẾ] Kênh công khai theo dõi tiến trình của một cuốc xe cụ thể (nhận cuốc, tài xế đến nơi, đang đi, hoàn tất, hủy).</w:t>
-      </w:r>
-    </w:p>
-    <w:p>
-      <w:pPr>
-        <w:ind w:left="360"/>
-        <w:spacing w:before="20" w:after="40"/>
-      </w:pPr>
-      <w:r>
-        <w:rPr>
-          <w:b/>
-          <w:sz w:val="19"/>
-          <w:color w:val="333333"/>
-          <w:rFonts w:ascii="Arial" w:hAnsi="Arial"/>
-        </w:rPr>
-        <w:t xml:space="preserve">• Phân quyền / Header: </w:t>
-      </w:r>
-      <w:r>
-        <w:rPr>
-          <w:sz w:val="19"/>
-          <w:color w:val="595959"/>
-          <w:rFonts w:ascii="Arial" w:hAnsi="Arial"/>
-        </w:rPr>
-        <w:t xml:space="preserve">Public / Dynamic theo bookingId</w:t>
-      </w:r>
-    </w:p>
-    <w:p>
-      <w:pPr>
-        <w:ind w:left="360"/>
-        <w:spacing w:before="20" w:after="40"/>
-      </w:pPr>
-      <w:r>
-        <w:rPr>
-          <w:b/>
-          <w:sz w:val="19"/>
-          <w:color w:val="333333"/>
-          <w:rFonts w:ascii="Arial" w:hAnsi="Arial"/>
-        </w:rPr>
-        <w:t xml:space="preserve">• Tham số (Path / Query Params): </w:t>
-      </w:r>
-      <w:r>
-        <w:rPr>
-          <w:sz w:val="19"/>
-          <w:color w:val="595959"/>
-          <w:rFonts w:ascii="Arial" w:hAnsi="Arial"/>
-        </w:rPr>
-        <w:t xml:space="preserve">bookingId (Long - ID cuốc xe đang theo dõi)</w:t>
-      </w:r>
-    </w:p>
-    <w:p>
-      <w:pPr>
-        <w:ind w:left="360"/>
-        <w:spacing w:before="20" w:after="60"/>
-      </w:pPr>
-      <w:r>
-        <w:rPr>
-          <w:b/>
-          <w:sz w:val="19"/>
-          <w:color w:val="333333"/>
-          <w:rFonts w:ascii="Arial" w:hAnsi="Arial"/>
-        </w:rPr>
-        <w:t xml:space="preserve">• Kết quả trả về (Response): </w:t>
-      </w:r>
-      <w:r>
-        <w:rPr>
-          <w:sz w:val="19"/>
-          <w:color w:val="2E75B6"/>
-          <w:rFonts w:ascii="Consolas" w:hAnsi="Consolas"/>
-        </w:rPr>
-        <w:t xml:space="preserve">BookingEventMessage (bookingId, status: ACCEPTED/ARRIVED/IN_PROGRESS/COMPLETED/CANCELLED, driverInfo: {id, name, phone, licensePlate})</w:t>
+        <w:t>• Kết quả trả về: BookingResponse với status, driverId, customerAvatarUrl, driverAvatarUrl và các trường chuyến xe; không có driverInfo lồng bên trong.</w:t>
       </w:r>
     </w:p>
     <w:p>

</xml_diff>